<commit_message>
Correction des horaires du déroulé pédagogique
Alignement du déroulé 102846 sur la convocation IGPDE du 9 octobre
2026 : matin 9h15-12h15, déjeuner 12h15-13h45 (1 h 30 au lieu de
1 h), après-midi 13h45-16h45. Durées et ordre des séquences inchangés.

Plage du module 2 corrigée : slides 54 à 73 au lieu de 54 à 83, les
slides 74 à 83 (quiz final, faites le point, checklists) relevant de
la synthèse du matin.

Changelog: non applicable — document de formation d'un projet, sans
effet sur le harnais ni sur un livrable publié du workspace
</commit_message>
<xml_diff>
--- a/IGPDE-102846-livrables-octobre-2026/Formateur/documents-administratifs-igpde/Derped-deroule-pedagogique-102846.docx
+++ b/IGPDE-102846-livrables-octobre-2026/Formateur/documents-administratifs-igpde/Derped-deroule-pedagogique-102846.docx
@@ -1066,7 +1066,7 @@
                 <w:rFonts w:ascii="Marianne" w:hAnsi="Marianne"/>
                 <w:sz w:val="18"/>
               </w:rPr>
-              <w:t>9h30 - 9h50</w:t>
+              <w:t>9h15 - 9h35</w:t>
               <w:br/>
               <w:t>20 minutes</w:t>
             </w:r>
@@ -1198,7 +1198,7 @@
                 <w:rFonts w:ascii="Marianne" w:hAnsi="Marianne"/>
                 <w:sz w:val="18"/>
               </w:rPr>
-              <w:t>9h50 - 10h35</w:t>
+              <w:t>9h35 - 10h20</w:t>
               <w:br/>
               <w:t>45 minutes</w:t>
             </w:r>
@@ -1330,7 +1330,7 @@
                 <w:rFonts w:ascii="Marianne" w:hAnsi="Marianne"/>
                 <w:sz w:val="18"/>
               </w:rPr>
-              <w:t>10h35 - 10h45</w:t>
+              <w:t>10h20 - 10h30</w:t>
               <w:br/>
               <w:t>10 minutes</w:t>
             </w:r>
@@ -1512,7 +1512,7 @@
                 <w:rFonts w:ascii="Marianne" w:hAnsi="Marianne"/>
                 <w:sz w:val="18"/>
               </w:rPr>
-              <w:t>10h45 - 12h15</w:t>
+              <w:t>10h30 - 12h00</w:t>
               <w:br/>
               <w:t>1 h 30</w:t>
             </w:r>
@@ -1621,7 +1621,7 @@
                 <w:rFonts w:ascii="Marianne" w:hAnsi="Marianne"/>
                 <w:sz w:val="18"/>
               </w:rPr>
-              <w:t>Support PPTX slides 54 à 83, 3 DOCX Sami (inaccessible, aide à la correction, accessible), Microsoft Word ou LibreOffice Writer, casque audio avec prise jack, vérificateur d'accessibilité Word.</w:t>
+              <w:t>Support PPTX slides 54 à 73, 3 DOCX Sami (inaccessible, aide à la correction, accessible), Microsoft Word ou LibreOffice Writer, casque audio avec prise jack, vérificateur d'accessibilité Word.</w:t>
             </w:r>
           </w:p>
         </w:tc>
@@ -1644,7 +1644,7 @@
                 <w:rFonts w:ascii="Marianne" w:hAnsi="Marianne"/>
                 <w:sz w:val="18"/>
               </w:rPr>
-              <w:t>12h15 - 12h30</w:t>
+              <w:t>12h00 - 12h15</w:t>
               <w:br/>
               <w:t>15 minutes</w:t>
             </w:r>
@@ -1776,9 +1776,9 @@
                 <w:rFonts w:ascii="Marianne" w:hAnsi="Marianne"/>
                 <w:sz w:val="18"/>
               </w:rPr>
-              <w:t>12h30 - 13h30</w:t>
+              <w:t>12h15 - 13h45</w:t>
               <w:br/>
-              <w:t>60 minutes</w:t>
+              <w:t>1 h 30</w:t>
             </w:r>
           </w:p>
         </w:tc>
@@ -2229,7 +2229,7 @@
                 <w:rFonts w:ascii="Marianne" w:hAnsi="Marianne"/>
                 <w:sz w:val="18"/>
               </w:rPr>
-              <w:t>13h30 - 14h50</w:t>
+              <w:t>13h45 - 15h05</w:t>
               <w:br/>
               <w:t>1 h 20</w:t>
             </w:r>
@@ -2361,7 +2361,7 @@
                 <w:rFonts w:ascii="Marianne" w:hAnsi="Marianne"/>
                 <w:sz w:val="18"/>
               </w:rPr>
-              <w:t>14h50 - 15h05</w:t>
+              <w:t>15h05 - 15h20</w:t>
               <w:br/>
               <w:t>15 minutes</w:t>
             </w:r>
@@ -2543,7 +2543,7 @@
                 <w:rFonts w:ascii="Marianne" w:hAnsi="Marianne"/>
                 <w:sz w:val="18"/>
               </w:rPr>
-              <w:t>15h05 - 16h05</w:t>
+              <w:t>15h20 - 16h20</w:t>
               <w:br/>
               <w:t>60 minutes</w:t>
             </w:r>
@@ -2675,7 +2675,7 @@
                 <w:rFonts w:ascii="Marianne" w:hAnsi="Marianne"/>
                 <w:sz w:val="18"/>
               </w:rPr>
-              <w:t>16h05 - 16h30</w:t>
+              <w:t>16h20 - 16h45</w:t>
               <w:br/>
               <w:t>25 minutes</w:t>
             </w:r>

</xml_diff>